<commit_message>
Add resource usage and bottleneck section to test report
</commit_message>
<xml_diff>
--- a/docs/SLIM_FULL_MESH_TEST_REPORT.docx
+++ b/docs/SLIM_FULL_MESH_TEST_REPORT.docx
@@ -5225,7 +5225,1225 @@
         <w:pStyle w:val="Heading1"/>
       </w:pPr>
       <w:r>
-        <w:t xml:space="preserve">8. Issues found and fixed during testing</w:t>
+        <w:t xml:space="preserve">8. Resource usage and bottleneck</w:t>
+      </w:r>
+    </w:p>
+    <w:p>
+      <w:pPr>
+        <w:spacing w:after="120"/>
+      </w:pPr>
+      <w:r>
+        <w:rPr>
+          <w:sz w:val="22"/>
+          <w:szCs w:val="22"/>
+        </w:rPr>
+        <w:t xml:space="preserve">Resource usage was sampled with docker stats (node container) and ps and top (host and client processes) during representative loads on the 12-core, 24 GB machine.</w:t>
+      </w:r>
+    </w:p>
+    <w:tbl>
+      <w:tblPr>
+        <w:tblW w:type="dxa" w:w="9360"/>
+        <w:tblBorders>
+          <w:top w:val="single" w:color="auto" w:sz="4"/>
+          <w:left w:val="single" w:color="auto" w:sz="4"/>
+          <w:bottom w:val="single" w:color="auto" w:sz="4"/>
+          <w:right w:val="single" w:color="auto" w:sz="4"/>
+          <w:insideH w:val="single" w:color="auto" w:sz="4"/>
+          <w:insideV w:val="single" w:color="auto" w:sz="4"/>
+        </w:tblBorders>
+      </w:tblPr>
+      <w:tblGrid>
+        <w:gridCol w:w="3060"/>
+        <w:gridCol w:w="2100"/>
+        <w:gridCol w:w="2100"/>
+        <w:gridCol w:w="2100"/>
+      </w:tblGrid>
+      <w:tr>
+        <w:trPr>
+          <w:tblHeader/>
+        </w:trPr>
+        <w:tc>
+          <w:tcPr>
+            <w:tcW w:type="dxa" w:w="3060"/>
+            <w:tcBorders>
+              <w:top w:val="single" w:color="BBBBBB" w:sz="1"/>
+              <w:left w:val="single" w:color="BBBBBB" w:sz="1"/>
+              <w:bottom w:val="single" w:color="BBBBBB" w:sz="1"/>
+              <w:right w:val="single" w:color="BBBBBB" w:sz="1"/>
+            </w:tcBorders>
+            <w:shd w:fill="D9E2EC" w:val="clear"/>
+            <w:tcMar>
+              <w:top w:type="dxa" w:w="60"/>
+              <w:left w:type="dxa" w:w="110"/>
+              <w:bottom w:type="dxa" w:w="60"/>
+              <w:right w:type="dxa" w:w="110"/>
+            </w:tcMar>
+          </w:tcPr>
+          <w:p>
+            <w:pPr>
+              <w:jc w:val="left"/>
+            </w:pPr>
+            <w:r>
+              <w:rPr>
+                <w:b/>
+                <w:bCs/>
+                <w:sz w:val="18"/>
+                <w:szCs w:val="18"/>
+              </w:rPr>
+              <w:t xml:space="preserve">Component</w:t>
+            </w:r>
+          </w:p>
+        </w:tc>
+        <w:tc>
+          <w:tcPr>
+            <w:tcW w:type="dxa" w:w="2100"/>
+            <w:tcBorders>
+              <w:top w:val="single" w:color="BBBBBB" w:sz="1"/>
+              <w:left w:val="single" w:color="BBBBBB" w:sz="1"/>
+              <w:bottom w:val="single" w:color="BBBBBB" w:sz="1"/>
+              <w:right w:val="single" w:color="BBBBBB" w:sz="1"/>
+            </w:tcBorders>
+            <w:shd w:fill="D9E2EC" w:val="clear"/>
+            <w:tcMar>
+              <w:top w:type="dxa" w:w="60"/>
+              <w:left w:type="dxa" w:w="110"/>
+              <w:bottom w:type="dxa" w:w="60"/>
+              <w:right w:type="dxa" w:w="110"/>
+            </w:tcMar>
+          </w:tcPr>
+          <w:p>
+            <w:pPr>
+              <w:jc w:val="right"/>
+            </w:pPr>
+            <w:r>
+              <w:rPr>
+                <w:b/>
+                <w:bCs/>
+                <w:sz w:val="18"/>
+                <w:szCs w:val="18"/>
+              </w:rPr>
+              <w:t xml:space="preserve">Memory</w:t>
+            </w:r>
+          </w:p>
+        </w:tc>
+        <w:tc>
+          <w:tcPr>
+            <w:tcW w:type="dxa" w:w="2100"/>
+            <w:tcBorders>
+              <w:top w:val="single" w:color="BBBBBB" w:sz="1"/>
+              <w:left w:val="single" w:color="BBBBBB" w:sz="1"/>
+              <w:bottom w:val="single" w:color="BBBBBB" w:sz="1"/>
+              <w:right w:val="single" w:color="BBBBBB" w:sz="1"/>
+            </w:tcBorders>
+            <w:shd w:fill="D9E2EC" w:val="clear"/>
+            <w:tcMar>
+              <w:top w:type="dxa" w:w="60"/>
+              <w:left w:type="dxa" w:w="110"/>
+              <w:bottom w:type="dxa" w:w="60"/>
+              <w:right w:type="dxa" w:w="110"/>
+            </w:tcMar>
+          </w:tcPr>
+          <w:p>
+            <w:pPr>
+              <w:jc w:val="right"/>
+            </w:pPr>
+            <w:r>
+              <w:rPr>
+                <w:b/>
+                <w:bCs/>
+                <w:sz w:val="18"/>
+                <w:szCs w:val="18"/>
+              </w:rPr>
+              <w:t xml:space="preserve">CPU</w:t>
+            </w:r>
+          </w:p>
+        </w:tc>
+        <w:tc>
+          <w:tcPr>
+            <w:tcW w:type="dxa" w:w="2100"/>
+            <w:tcBorders>
+              <w:top w:val="single" w:color="BBBBBB" w:sz="1"/>
+              <w:left w:val="single" w:color="BBBBBB" w:sz="1"/>
+              <w:bottom w:val="single" w:color="BBBBBB" w:sz="1"/>
+              <w:right w:val="single" w:color="BBBBBB" w:sz="1"/>
+            </w:tcBorders>
+            <w:shd w:fill="D9E2EC" w:val="clear"/>
+            <w:tcMar>
+              <w:top w:type="dxa" w:w="60"/>
+              <w:left w:type="dxa" w:w="110"/>
+              <w:bottom w:type="dxa" w:w="60"/>
+              <w:right w:type="dxa" w:w="110"/>
+            </w:tcMar>
+          </w:tcPr>
+          <w:p>
+            <w:pPr>
+              <w:jc w:val="right"/>
+            </w:pPr>
+            <w:r>
+              <w:rPr>
+                <w:b/>
+                <w:bCs/>
+                <w:sz w:val="18"/>
+                <w:szCs w:val="18"/>
+              </w:rPr>
+              <w:t xml:space="preserve">Bottleneck?</w:t>
+            </w:r>
+          </w:p>
+        </w:tc>
+      </w:tr>
+      <w:tr>
+        <w:trPr>
+          <w:tblHeader w:val="false"/>
+        </w:trPr>
+        <w:tc>
+          <w:tcPr>
+            <w:tcW w:type="dxa" w:w="3060"/>
+            <w:tcBorders>
+              <w:top w:val="single" w:color="BBBBBB" w:sz="1"/>
+              <w:left w:val="single" w:color="BBBBBB" w:sz="1"/>
+              <w:bottom w:val="single" w:color="BBBBBB" w:sz="1"/>
+              <w:right w:val="single" w:color="BBBBBB" w:sz="1"/>
+            </w:tcBorders>
+            <w:shd w:fill="FFFFFF" w:val="clear"/>
+            <w:tcMar>
+              <w:top w:type="dxa" w:w="60"/>
+              <w:left w:type="dxa" w:w="110"/>
+              <w:bottom w:type="dxa" w:w="60"/>
+              <w:right w:type="dxa" w:w="110"/>
+            </w:tcMar>
+          </w:tcPr>
+          <w:p>
+            <w:pPr>
+              <w:jc w:val="left"/>
+            </w:pPr>
+            <w:r>
+              <w:rPr>
+                <w:b w:val="false"/>
+                <w:bCs w:val="false"/>
+                <w:sz w:val="18"/>
+                <w:szCs w:val="18"/>
+              </w:rPr>
+              <w:t xml:space="preserve">SLIM node (broker)</w:t>
+            </w:r>
+          </w:p>
+        </w:tc>
+        <w:tc>
+          <w:tcPr>
+            <w:tcW w:type="dxa" w:w="2100"/>
+            <w:tcBorders>
+              <w:top w:val="single" w:color="BBBBBB" w:sz="1"/>
+              <w:left w:val="single" w:color="BBBBBB" w:sz="1"/>
+              <w:bottom w:val="single" w:color="BBBBBB" w:sz="1"/>
+              <w:right w:val="single" w:color="BBBBBB" w:sz="1"/>
+            </w:tcBorders>
+            <w:shd w:fill="FFFFFF" w:val="clear"/>
+            <w:tcMar>
+              <w:top w:type="dxa" w:w="60"/>
+              <w:left w:type="dxa" w:w="110"/>
+              <w:bottom w:type="dxa" w:w="60"/>
+              <w:right w:type="dxa" w:w="110"/>
+            </w:tcMar>
+          </w:tcPr>
+          <w:p>
+            <w:pPr>
+              <w:jc w:val="right"/>
+            </w:pPr>
+            <w:r>
+              <w:rPr>
+                <w:b w:val="false"/>
+                <w:bCs w:val="false"/>
+                <w:sz w:val="18"/>
+                <w:szCs w:val="18"/>
+              </w:rPr>
+              <w:t xml:space="preserve">6-17 MB</w:t>
+            </w:r>
+          </w:p>
+        </w:tc>
+        <w:tc>
+          <w:tcPr>
+            <w:tcW w:type="dxa" w:w="2100"/>
+            <w:tcBorders>
+              <w:top w:val="single" w:color="BBBBBB" w:sz="1"/>
+              <w:left w:val="single" w:color="BBBBBB" w:sz="1"/>
+              <w:bottom w:val="single" w:color="BBBBBB" w:sz="1"/>
+              <w:right w:val="single" w:color="BBBBBB" w:sz="1"/>
+            </w:tcBorders>
+            <w:shd w:fill="FFFFFF" w:val="clear"/>
+            <w:tcMar>
+              <w:top w:type="dxa" w:w="60"/>
+              <w:left w:type="dxa" w:w="110"/>
+              <w:bottom w:type="dxa" w:w="60"/>
+              <w:right w:type="dxa" w:w="110"/>
+            </w:tcMar>
+          </w:tcPr>
+          <w:p>
+            <w:pPr>
+              <w:jc w:val="right"/>
+            </w:pPr>
+            <w:r>
+              <w:rPr>
+                <w:b w:val="false"/>
+                <w:bCs w:val="false"/>
+                <w:sz w:val="18"/>
+                <w:szCs w:val="18"/>
+              </w:rPr>
+              <w:t xml:space="preserve">0-68% of 1 core</w:t>
+            </w:r>
+          </w:p>
+        </w:tc>
+        <w:tc>
+          <w:tcPr>
+            <w:tcW w:type="dxa" w:w="2100"/>
+            <w:tcBorders>
+              <w:top w:val="single" w:color="BBBBBB" w:sz="1"/>
+              <w:left w:val="single" w:color="BBBBBB" w:sz="1"/>
+              <w:bottom w:val="single" w:color="BBBBBB" w:sz="1"/>
+              <w:right w:val="single" w:color="BBBBBB" w:sz="1"/>
+            </w:tcBorders>
+            <w:shd w:fill="FFFFFF" w:val="clear"/>
+            <w:tcMar>
+              <w:top w:type="dxa" w:w="60"/>
+              <w:left w:type="dxa" w:w="110"/>
+              <w:bottom w:type="dxa" w:w="60"/>
+              <w:right w:type="dxa" w:w="110"/>
+            </w:tcMar>
+          </w:tcPr>
+          <w:p>
+            <w:pPr>
+              <w:jc w:val="right"/>
+            </w:pPr>
+            <w:r>
+              <w:rPr>
+                <w:b w:val="false"/>
+                <w:bCs w:val="false"/>
+                <w:sz w:val="18"/>
+                <w:szCs w:val="18"/>
+              </w:rPr>
+              <w:t xml:space="preserve">No</w:t>
+            </w:r>
+          </w:p>
+        </w:tc>
+      </w:tr>
+      <w:tr>
+        <w:trPr>
+          <w:tblHeader w:val="false"/>
+        </w:trPr>
+        <w:tc>
+          <w:tcPr>
+            <w:tcW w:type="dxa" w:w="3060"/>
+            <w:tcBorders>
+              <w:top w:val="single" w:color="BBBBBB" w:sz="1"/>
+              <w:left w:val="single" w:color="BBBBBB" w:sz="1"/>
+              <w:bottom w:val="single" w:color="BBBBBB" w:sz="1"/>
+              <w:right w:val="single" w:color="BBBBBB" w:sz="1"/>
+            </w:tcBorders>
+            <w:shd w:fill="F2F5F8" w:val="clear"/>
+            <w:tcMar>
+              <w:top w:type="dxa" w:w="60"/>
+              <w:left w:type="dxa" w:w="110"/>
+              <w:bottom w:type="dxa" w:w="60"/>
+              <w:right w:type="dxa" w:w="110"/>
+            </w:tcMar>
+          </w:tcPr>
+          <w:p>
+            <w:pPr>
+              <w:jc w:val="left"/>
+            </w:pPr>
+            <w:r>
+              <w:rPr>
+                <w:b w:val="false"/>
+                <w:bCs w:val="false"/>
+                <w:sz w:val="18"/>
+                <w:szCs w:val="18"/>
+              </w:rPr>
+              <w:t xml:space="preserve">Client process, HTTP/SLIM</w:t>
+            </w:r>
+          </w:p>
+        </w:tc>
+        <w:tc>
+          <w:tcPr>
+            <w:tcW w:type="dxa" w:w="2100"/>
+            <w:tcBorders>
+              <w:top w:val="single" w:color="BBBBBB" w:sz="1"/>
+              <w:left w:val="single" w:color="BBBBBB" w:sz="1"/>
+              <w:bottom w:val="single" w:color="BBBBBB" w:sz="1"/>
+              <w:right w:val="single" w:color="BBBBBB" w:sz="1"/>
+            </w:tcBorders>
+            <w:shd w:fill="F2F5F8" w:val="clear"/>
+            <w:tcMar>
+              <w:top w:type="dxa" w:w="60"/>
+              <w:left w:type="dxa" w:w="110"/>
+              <w:bottom w:type="dxa" w:w="60"/>
+              <w:right w:type="dxa" w:w="110"/>
+            </w:tcMar>
+          </w:tcPr>
+          <w:p>
+            <w:pPr>
+              <w:jc w:val="right"/>
+            </w:pPr>
+            <w:r>
+              <w:rPr>
+                <w:b w:val="false"/>
+                <w:bCs w:val="false"/>
+                <w:sz w:val="18"/>
+                <w:szCs w:val="18"/>
+              </w:rPr>
+              <w:t xml:space="preserve">~44 MB each</w:t>
+            </w:r>
+          </w:p>
+        </w:tc>
+        <w:tc>
+          <w:tcPr>
+            <w:tcW w:type="dxa" w:w="2100"/>
+            <w:tcBorders>
+              <w:top w:val="single" w:color="BBBBBB" w:sz="1"/>
+              <w:left w:val="single" w:color="BBBBBB" w:sz="1"/>
+              <w:bottom w:val="single" w:color="BBBBBB" w:sz="1"/>
+              <w:right w:val="single" w:color="BBBBBB" w:sz="1"/>
+            </w:tcBorders>
+            <w:shd w:fill="F2F5F8" w:val="clear"/>
+            <w:tcMar>
+              <w:top w:type="dxa" w:w="60"/>
+              <w:left w:type="dxa" w:w="110"/>
+              <w:bottom w:type="dxa" w:w="60"/>
+              <w:right w:type="dxa" w:w="110"/>
+            </w:tcMar>
+          </w:tcPr>
+          <w:p>
+            <w:pPr>
+              <w:jc w:val="right"/>
+            </w:pPr>
+            <w:r>
+              <w:rPr>
+                <w:b w:val="false"/>
+                <w:bCs w:val="false"/>
+                <w:sz w:val="18"/>
+                <w:szCs w:val="18"/>
+              </w:rPr>
+              <w:t xml:space="preserve">shares host cores</w:t>
+            </w:r>
+          </w:p>
+        </w:tc>
+        <w:tc>
+          <w:tcPr>
+            <w:tcW w:type="dxa" w:w="2100"/>
+            <w:tcBorders>
+              <w:top w:val="single" w:color="BBBBBB" w:sz="1"/>
+              <w:left w:val="single" w:color="BBBBBB" w:sz="1"/>
+              <w:bottom w:val="single" w:color="BBBBBB" w:sz="1"/>
+              <w:right w:val="single" w:color="BBBBBB" w:sz="1"/>
+            </w:tcBorders>
+            <w:shd w:fill="F2F5F8" w:val="clear"/>
+            <w:tcMar>
+              <w:top w:type="dxa" w:w="60"/>
+              <w:left w:type="dxa" w:w="110"/>
+              <w:bottom w:type="dxa" w:w="60"/>
+              <w:right w:type="dxa" w:w="110"/>
+            </w:tcMar>
+          </w:tcPr>
+          <w:p>
+            <w:pPr>
+              <w:jc w:val="right"/>
+            </w:pPr>
+            <w:r>
+              <w:rPr>
+                <w:b w:val="false"/>
+                <w:bCs w:val="false"/>
+                <w:sz w:val="18"/>
+                <w:szCs w:val="18"/>
+              </w:rPr>
+              <w:t xml:space="preserve">Yes (CPU)</w:t>
+            </w:r>
+          </w:p>
+        </w:tc>
+      </w:tr>
+      <w:tr>
+        <w:trPr>
+          <w:tblHeader w:val="false"/>
+        </w:trPr>
+        <w:tc>
+          <w:tcPr>
+            <w:tcW w:type="dxa" w:w="3060"/>
+            <w:tcBorders>
+              <w:top w:val="single" w:color="BBBBBB" w:sz="1"/>
+              <w:left w:val="single" w:color="BBBBBB" w:sz="1"/>
+              <w:bottom w:val="single" w:color="BBBBBB" w:sz="1"/>
+              <w:right w:val="single" w:color="BBBBBB" w:sz="1"/>
+            </w:tcBorders>
+            <w:shd w:fill="FFFFFF" w:val="clear"/>
+            <w:tcMar>
+              <w:top w:type="dxa" w:w="60"/>
+              <w:left w:type="dxa" w:w="110"/>
+              <w:bottom w:type="dxa" w:w="60"/>
+              <w:right w:type="dxa" w:w="110"/>
+            </w:tcMar>
+          </w:tcPr>
+          <w:p>
+            <w:pPr>
+              <w:jc w:val="left"/>
+            </w:pPr>
+            <w:r>
+              <w:rPr>
+                <w:b w:val="false"/>
+                <w:bCs w:val="false"/>
+                <w:sz w:val="18"/>
+                <w:szCs w:val="18"/>
+              </w:rPr>
+              <w:t xml:space="preserve">Client process, A2A</w:t>
+            </w:r>
+          </w:p>
+        </w:tc>
+        <w:tc>
+          <w:tcPr>
+            <w:tcW w:type="dxa" w:w="2100"/>
+            <w:tcBorders>
+              <w:top w:val="single" w:color="BBBBBB" w:sz="1"/>
+              <w:left w:val="single" w:color="BBBBBB" w:sz="1"/>
+              <w:bottom w:val="single" w:color="BBBBBB" w:sz="1"/>
+              <w:right w:val="single" w:color="BBBBBB" w:sz="1"/>
+            </w:tcBorders>
+            <w:shd w:fill="FFFFFF" w:val="clear"/>
+            <w:tcMar>
+              <w:top w:type="dxa" w:w="60"/>
+              <w:left w:type="dxa" w:w="110"/>
+              <w:bottom w:type="dxa" w:w="60"/>
+              <w:right w:type="dxa" w:w="110"/>
+            </w:tcMar>
+          </w:tcPr>
+          <w:p>
+            <w:pPr>
+              <w:jc w:val="right"/>
+            </w:pPr>
+            <w:r>
+              <w:rPr>
+                <w:b w:val="false"/>
+                <w:bCs w:val="false"/>
+                <w:sz w:val="18"/>
+                <w:szCs w:val="18"/>
+              </w:rPr>
+              <w:t xml:space="preserve">~136 MB each</w:t>
+            </w:r>
+          </w:p>
+        </w:tc>
+        <w:tc>
+          <w:tcPr>
+            <w:tcW w:type="dxa" w:w="2100"/>
+            <w:tcBorders>
+              <w:top w:val="single" w:color="BBBBBB" w:sz="1"/>
+              <w:left w:val="single" w:color="BBBBBB" w:sz="1"/>
+              <w:bottom w:val="single" w:color="BBBBBB" w:sz="1"/>
+              <w:right w:val="single" w:color="BBBBBB" w:sz="1"/>
+            </w:tcBorders>
+            <w:shd w:fill="FFFFFF" w:val="clear"/>
+            <w:tcMar>
+              <w:top w:type="dxa" w:w="60"/>
+              <w:left w:type="dxa" w:w="110"/>
+              <w:bottom w:type="dxa" w:w="60"/>
+              <w:right w:type="dxa" w:w="110"/>
+            </w:tcMar>
+          </w:tcPr>
+          <w:p>
+            <w:pPr>
+              <w:jc w:val="right"/>
+            </w:pPr>
+            <w:r>
+              <w:rPr>
+                <w:b w:val="false"/>
+                <w:bCs w:val="false"/>
+                <w:sz w:val="18"/>
+                <w:szCs w:val="18"/>
+              </w:rPr>
+              <w:t xml:space="preserve">shares host cores</w:t>
+            </w:r>
+          </w:p>
+        </w:tc>
+        <w:tc>
+          <w:tcPr>
+            <w:tcW w:type="dxa" w:w="2100"/>
+            <w:tcBorders>
+              <w:top w:val="single" w:color="BBBBBB" w:sz="1"/>
+              <w:left w:val="single" w:color="BBBBBB" w:sz="1"/>
+              <w:bottom w:val="single" w:color="BBBBBB" w:sz="1"/>
+              <w:right w:val="single" w:color="BBBBBB" w:sz="1"/>
+            </w:tcBorders>
+            <w:shd w:fill="FFFFFF" w:val="clear"/>
+            <w:tcMar>
+              <w:top w:type="dxa" w:w="60"/>
+              <w:left w:type="dxa" w:w="110"/>
+              <w:bottom w:type="dxa" w:w="60"/>
+              <w:right w:type="dxa" w:w="110"/>
+            </w:tcMar>
+          </w:tcPr>
+          <w:p>
+            <w:pPr>
+              <w:jc w:val="right"/>
+            </w:pPr>
+            <w:r>
+              <w:rPr>
+                <w:b w:val="false"/>
+                <w:bCs w:val="false"/>
+                <w:sz w:val="18"/>
+                <w:szCs w:val="18"/>
+              </w:rPr>
+              <w:t xml:space="preserve">Yes (CPU+mem)</w:t>
+            </w:r>
+          </w:p>
+        </w:tc>
+      </w:tr>
+      <w:tr>
+        <w:trPr>
+          <w:tblHeader w:val="false"/>
+        </w:trPr>
+        <w:tc>
+          <w:tcPr>
+            <w:tcW w:type="dxa" w:w="3060"/>
+            <w:tcBorders>
+              <w:top w:val="single" w:color="BBBBBB" w:sz="1"/>
+              <w:left w:val="single" w:color="BBBBBB" w:sz="1"/>
+              <w:bottom w:val="single" w:color="BBBBBB" w:sz="1"/>
+              <w:right w:val="single" w:color="BBBBBB" w:sz="1"/>
+            </w:tcBorders>
+            <w:shd w:fill="F2F5F8" w:val="clear"/>
+            <w:tcMar>
+              <w:top w:type="dxa" w:w="60"/>
+              <w:left w:type="dxa" w:w="110"/>
+              <w:bottom w:type="dxa" w:w="60"/>
+              <w:right w:type="dxa" w:w="110"/>
+            </w:tcMar>
+          </w:tcPr>
+          <w:p>
+            <w:pPr>
+              <w:jc w:val="left"/>
+            </w:pPr>
+            <w:r>
+              <w:rPr>
+                <w:b w:val="false"/>
+                <w:bCs w:val="false"/>
+                <w:sz w:val="18"/>
+                <w:szCs w:val="18"/>
+              </w:rPr>
+              <w:t xml:space="preserve">Loopback network</w:t>
+            </w:r>
+          </w:p>
+        </w:tc>
+        <w:tc>
+          <w:tcPr>
+            <w:tcW w:type="dxa" w:w="2100"/>
+            <w:tcBorders>
+              <w:top w:val="single" w:color="BBBBBB" w:sz="1"/>
+              <w:left w:val="single" w:color="BBBBBB" w:sz="1"/>
+              <w:bottom w:val="single" w:color="BBBBBB" w:sz="1"/>
+              <w:right w:val="single" w:color="BBBBBB" w:sz="1"/>
+            </w:tcBorders>
+            <w:shd w:fill="F2F5F8" w:val="clear"/>
+            <w:tcMar>
+              <w:top w:type="dxa" w:w="60"/>
+              <w:left w:type="dxa" w:w="110"/>
+              <w:bottom w:type="dxa" w:w="60"/>
+              <w:right w:type="dxa" w:w="110"/>
+            </w:tcMar>
+          </w:tcPr>
+          <w:p>
+            <w:pPr>
+              <w:jc w:val="right"/>
+            </w:pPr>
+            <w:r>
+              <w:rPr>
+                <w:b w:val="false"/>
+                <w:bCs w:val="false"/>
+                <w:sz w:val="18"/>
+                <w:szCs w:val="18"/>
+              </w:rPr>
+              <w:t xml:space="preserve">KB-scale</w:t>
+            </w:r>
+          </w:p>
+        </w:tc>
+        <w:tc>
+          <w:tcPr>
+            <w:tcW w:type="dxa" w:w="2100"/>
+            <w:tcBorders>
+              <w:top w:val="single" w:color="BBBBBB" w:sz="1"/>
+              <w:left w:val="single" w:color="BBBBBB" w:sz="1"/>
+              <w:bottom w:val="single" w:color="BBBBBB" w:sz="1"/>
+              <w:right w:val="single" w:color="BBBBBB" w:sz="1"/>
+            </w:tcBorders>
+            <w:shd w:fill="F2F5F8" w:val="clear"/>
+            <w:tcMar>
+              <w:top w:type="dxa" w:w="60"/>
+              <w:left w:type="dxa" w:w="110"/>
+              <w:bottom w:type="dxa" w:w="60"/>
+              <w:right w:type="dxa" w:w="110"/>
+            </w:tcMar>
+          </w:tcPr>
+          <w:p>
+            <w:pPr>
+              <w:jc w:val="right"/>
+            </w:pPr>
+            <w:r>
+              <w:rPr>
+                <w:b w:val="false"/>
+                <w:bCs w:val="false"/>
+                <w:sz w:val="18"/>
+                <w:szCs w:val="18"/>
+              </w:rPr>
+              <w:t xml:space="preserve">negligible</w:t>
+            </w:r>
+          </w:p>
+        </w:tc>
+        <w:tc>
+          <w:tcPr>
+            <w:tcW w:type="dxa" w:w="2100"/>
+            <w:tcBorders>
+              <w:top w:val="single" w:color="BBBBBB" w:sz="1"/>
+              <w:left w:val="single" w:color="BBBBBB" w:sz="1"/>
+              <w:bottom w:val="single" w:color="BBBBBB" w:sz="1"/>
+              <w:right w:val="single" w:color="BBBBBB" w:sz="1"/>
+            </w:tcBorders>
+            <w:shd w:fill="F2F5F8" w:val="clear"/>
+            <w:tcMar>
+              <w:top w:type="dxa" w:w="60"/>
+              <w:left w:type="dxa" w:w="110"/>
+              <w:bottom w:type="dxa" w:w="60"/>
+              <w:right w:type="dxa" w:w="110"/>
+            </w:tcMar>
+          </w:tcPr>
+          <w:p>
+            <w:pPr>
+              <w:jc w:val="right"/>
+            </w:pPr>
+            <w:r>
+              <w:rPr>
+                <w:b w:val="false"/>
+                <w:bCs w:val="false"/>
+                <w:sz w:val="18"/>
+                <w:szCs w:val="18"/>
+              </w:rPr>
+              <w:t xml:space="preserve">No</w:t>
+            </w:r>
+          </w:p>
+        </w:tc>
+      </w:tr>
+    </w:tbl>
+    <w:p>
+      <w:pPr>
+        <w:spacing w:after="120"/>
+      </w:pPr>
+      <w:r>
+        <w:rPr>
+          <w:sz w:val="22"/>
+          <w:szCs w:val="22"/>
+        </w:rPr>
+        <w:t xml:space="preserve">Across modes, client CPU usage tracks how the work spreads over cores:</w:t>
+      </w:r>
+    </w:p>
+    <w:tbl>
+      <w:tblPr>
+        <w:tblW w:type="dxa" w:w="9360"/>
+        <w:tblBorders>
+          <w:top w:val="single" w:color="auto" w:sz="4"/>
+          <w:left w:val="single" w:color="auto" w:sz="4"/>
+          <w:bottom w:val="single" w:color="auto" w:sz="4"/>
+          <w:right w:val="single" w:color="auto" w:sz="4"/>
+          <w:insideH w:val="single" w:color="auto" w:sz="4"/>
+          <w:insideV w:val="single" w:color="auto" w:sz="4"/>
+        </w:tblBorders>
+      </w:tblPr>
+      <w:tblGrid>
+        <w:gridCol w:w="2400"/>
+        <w:gridCol w:w="2400"/>
+        <w:gridCol w:w="4560"/>
+      </w:tblGrid>
+      <w:tr>
+        <w:trPr>
+          <w:tblHeader/>
+        </w:trPr>
+        <w:tc>
+          <w:tcPr>
+            <w:tcW w:type="dxa" w:w="2400"/>
+            <w:tcBorders>
+              <w:top w:val="single" w:color="BBBBBB" w:sz="1"/>
+              <w:left w:val="single" w:color="BBBBBB" w:sz="1"/>
+              <w:bottom w:val="single" w:color="BBBBBB" w:sz="1"/>
+              <w:right w:val="single" w:color="BBBBBB" w:sz="1"/>
+            </w:tcBorders>
+            <w:shd w:fill="D9E2EC" w:val="clear"/>
+            <w:tcMar>
+              <w:top w:type="dxa" w:w="60"/>
+              <w:left w:type="dxa" w:w="110"/>
+              <w:bottom w:type="dxa" w:w="60"/>
+              <w:right w:type="dxa" w:w="110"/>
+            </w:tcMar>
+          </w:tcPr>
+          <w:p>
+            <w:pPr>
+              <w:jc w:val="left"/>
+            </w:pPr>
+            <w:r>
+              <w:rPr>
+                <w:b/>
+                <w:bCs/>
+                <w:sz w:val="18"/>
+                <w:szCs w:val="18"/>
+              </w:rPr>
+              <w:t xml:space="preserve">Mode</w:t>
+            </w:r>
+          </w:p>
+        </w:tc>
+        <w:tc>
+          <w:tcPr>
+            <w:tcW w:type="dxa" w:w="2400"/>
+            <w:tcBorders>
+              <w:top w:val="single" w:color="BBBBBB" w:sz="1"/>
+              <w:left w:val="single" w:color="BBBBBB" w:sz="1"/>
+              <w:bottom w:val="single" w:color="BBBBBB" w:sz="1"/>
+              <w:right w:val="single" w:color="BBBBBB" w:sz="1"/>
+            </w:tcBorders>
+            <w:shd w:fill="D9E2EC" w:val="clear"/>
+            <w:tcMar>
+              <w:top w:type="dxa" w:w="60"/>
+              <w:left w:type="dxa" w:w="110"/>
+              <w:bottom w:type="dxa" w:w="60"/>
+              <w:right w:type="dxa" w:w="110"/>
+            </w:tcMar>
+          </w:tcPr>
+          <w:p>
+            <w:pPr>
+              <w:jc w:val="right"/>
+            </w:pPr>
+            <w:r>
+              <w:rPr>
+                <w:b/>
+                <w:bCs/>
+                <w:sz w:val="18"/>
+                <w:szCs w:val="18"/>
+              </w:rPr>
+              <w:t xml:space="preserve">Cores used</w:t>
+            </w:r>
+          </w:p>
+        </w:tc>
+        <w:tc>
+          <w:tcPr>
+            <w:tcW w:type="dxa" w:w="4560"/>
+            <w:tcBorders>
+              <w:top w:val="single" w:color="BBBBBB" w:sz="1"/>
+              <w:left w:val="single" w:color="BBBBBB" w:sz="1"/>
+              <w:bottom w:val="single" w:color="BBBBBB" w:sz="1"/>
+              <w:right w:val="single" w:color="BBBBBB" w:sz="1"/>
+            </w:tcBorders>
+            <w:shd w:fill="D9E2EC" w:val="clear"/>
+            <w:tcMar>
+              <w:top w:type="dxa" w:w="60"/>
+              <w:left w:type="dxa" w:w="110"/>
+              <w:bottom w:type="dxa" w:w="60"/>
+              <w:right w:type="dxa" w:w="110"/>
+            </w:tcMar>
+          </w:tcPr>
+          <w:p>
+            <w:pPr>
+              <w:jc w:val="right"/>
+            </w:pPr>
+            <w:r>
+              <w:rPr>
+                <w:b/>
+                <w:bCs/>
+                <w:sz w:val="18"/>
+                <w:szCs w:val="18"/>
+              </w:rPr>
+              <w:t xml:space="preserve">Note</w:t>
+            </w:r>
+          </w:p>
+        </w:tc>
+      </w:tr>
+      <w:tr>
+        <w:trPr>
+          <w:tblHeader w:val="false"/>
+        </w:trPr>
+        <w:tc>
+          <w:tcPr>
+            <w:tcW w:type="dxa" w:w="2400"/>
+            <w:tcBorders>
+              <w:top w:val="single" w:color="BBBBBB" w:sz="1"/>
+              <w:left w:val="single" w:color="BBBBBB" w:sz="1"/>
+              <w:bottom w:val="single" w:color="BBBBBB" w:sz="1"/>
+              <w:right w:val="single" w:color="BBBBBB" w:sz="1"/>
+            </w:tcBorders>
+            <w:shd w:fill="FFFFFF" w:val="clear"/>
+            <w:tcMar>
+              <w:top w:type="dxa" w:w="60"/>
+              <w:left w:type="dxa" w:w="110"/>
+              <w:bottom w:type="dxa" w:w="60"/>
+              <w:right w:type="dxa" w:w="110"/>
+            </w:tcMar>
+          </w:tcPr>
+          <w:p>
+            <w:pPr>
+              <w:jc w:val="left"/>
+            </w:pPr>
+            <w:r>
+              <w:rPr>
+                <w:b w:val="false"/>
+                <w:bCs w:val="false"/>
+                <w:sz w:val="18"/>
+                <w:szCs w:val="18"/>
+              </w:rPr>
+              <w:t xml:space="preserve">Sequential</w:t>
+            </w:r>
+          </w:p>
+        </w:tc>
+        <w:tc>
+          <w:tcPr>
+            <w:tcW w:type="dxa" w:w="2400"/>
+            <w:tcBorders>
+              <w:top w:val="single" w:color="BBBBBB" w:sz="1"/>
+              <w:left w:val="single" w:color="BBBBBB" w:sz="1"/>
+              <w:bottom w:val="single" w:color="BBBBBB" w:sz="1"/>
+              <w:right w:val="single" w:color="BBBBBB" w:sz="1"/>
+            </w:tcBorders>
+            <w:shd w:fill="FFFFFF" w:val="clear"/>
+            <w:tcMar>
+              <w:top w:type="dxa" w:w="60"/>
+              <w:left w:type="dxa" w:w="110"/>
+              <w:bottom w:type="dxa" w:w="60"/>
+              <w:right w:type="dxa" w:w="110"/>
+            </w:tcMar>
+          </w:tcPr>
+          <w:p>
+            <w:pPr>
+              <w:jc w:val="right"/>
+            </w:pPr>
+            <w:r>
+              <w:rPr>
+                <w:b w:val="false"/>
+                <w:bCs w:val="false"/>
+                <w:sz w:val="18"/>
+                <w:szCs w:val="18"/>
+              </w:rPr>
+              <w:t xml:space="preserve">~1.5</w:t>
+            </w:r>
+          </w:p>
+        </w:tc>
+        <w:tc>
+          <w:tcPr>
+            <w:tcW w:type="dxa" w:w="4560"/>
+            <w:tcBorders>
+              <w:top w:val="single" w:color="BBBBBB" w:sz="1"/>
+              <w:left w:val="single" w:color="BBBBBB" w:sz="1"/>
+              <w:bottom w:val="single" w:color="BBBBBB" w:sz="1"/>
+              <w:right w:val="single" w:color="BBBBBB" w:sz="1"/>
+            </w:tcBorders>
+            <w:shd w:fill="FFFFFF" w:val="clear"/>
+            <w:tcMar>
+              <w:top w:type="dxa" w:w="60"/>
+              <w:left w:type="dxa" w:w="110"/>
+              <w:bottom w:type="dxa" w:w="60"/>
+              <w:right w:type="dxa" w:w="110"/>
+            </w:tcMar>
+          </w:tcPr>
+          <w:p>
+            <w:pPr>
+              <w:jc w:val="right"/>
+            </w:pPr>
+            <w:r>
+              <w:rPr>
+                <w:b w:val="false"/>
+                <w:bCs w:val="false"/>
+                <w:sz w:val="18"/>
+                <w:szCs w:val="18"/>
+              </w:rPr>
+              <w:t xml:space="preserve">1 Python thread plus SLIM Rust runtime; GIL-bound</w:t>
+            </w:r>
+          </w:p>
+        </w:tc>
+      </w:tr>
+      <w:tr>
+        <w:trPr>
+          <w:tblHeader w:val="false"/>
+        </w:trPr>
+        <w:tc>
+          <w:tcPr>
+            <w:tcW w:type="dxa" w:w="2400"/>
+            <w:tcBorders>
+              <w:top w:val="single" w:color="BBBBBB" w:sz="1"/>
+              <w:left w:val="single" w:color="BBBBBB" w:sz="1"/>
+              <w:bottom w:val="single" w:color="BBBBBB" w:sz="1"/>
+              <w:right w:val="single" w:color="BBBBBB" w:sz="1"/>
+            </w:tcBorders>
+            <w:shd w:fill="F2F5F8" w:val="clear"/>
+            <w:tcMar>
+              <w:top w:type="dxa" w:w="60"/>
+              <w:left w:type="dxa" w:w="110"/>
+              <w:bottom w:type="dxa" w:w="60"/>
+              <w:right w:type="dxa" w:w="110"/>
+            </w:tcMar>
+          </w:tcPr>
+          <w:p>
+            <w:pPr>
+              <w:jc w:val="left"/>
+            </w:pPr>
+            <w:r>
+              <w:rPr>
+                <w:b w:val="false"/>
+                <w:bCs w:val="false"/>
+                <w:sz w:val="18"/>
+                <w:szCs w:val="18"/>
+              </w:rPr>
+              <w:t xml:space="preserve">Concurrent (threads)</w:t>
+            </w:r>
+          </w:p>
+        </w:tc>
+        <w:tc>
+          <w:tcPr>
+            <w:tcW w:type="dxa" w:w="2400"/>
+            <w:tcBorders>
+              <w:top w:val="single" w:color="BBBBBB" w:sz="1"/>
+              <w:left w:val="single" w:color="BBBBBB" w:sz="1"/>
+              <w:bottom w:val="single" w:color="BBBBBB" w:sz="1"/>
+              <w:right w:val="single" w:color="BBBBBB" w:sz="1"/>
+            </w:tcBorders>
+            <w:shd w:fill="F2F5F8" w:val="clear"/>
+            <w:tcMar>
+              <w:top w:type="dxa" w:w="60"/>
+              <w:left w:type="dxa" w:w="110"/>
+              <w:bottom w:type="dxa" w:w="60"/>
+              <w:right w:type="dxa" w:w="110"/>
+            </w:tcMar>
+          </w:tcPr>
+          <w:p>
+            <w:pPr>
+              <w:jc w:val="right"/>
+            </w:pPr>
+            <w:r>
+              <w:rPr>
+                <w:b w:val="false"/>
+                <w:bCs w:val="false"/>
+                <w:sz w:val="18"/>
+                <w:szCs w:val="18"/>
+              </w:rPr>
+              <w:t xml:space="preserve">~1.5 effective</w:t>
+            </w:r>
+          </w:p>
+        </w:tc>
+        <w:tc>
+          <w:tcPr>
+            <w:tcW w:type="dxa" w:w="4560"/>
+            <w:tcBorders>
+              <w:top w:val="single" w:color="BBBBBB" w:sz="1"/>
+              <w:left w:val="single" w:color="BBBBBB" w:sz="1"/>
+              <w:bottom w:val="single" w:color="BBBBBB" w:sz="1"/>
+              <w:right w:val="single" w:color="BBBBBB" w:sz="1"/>
+            </w:tcBorders>
+            <w:shd w:fill="F2F5F8" w:val="clear"/>
+            <w:tcMar>
+              <w:top w:type="dxa" w:w="60"/>
+              <w:left w:type="dxa" w:w="110"/>
+              <w:bottom w:type="dxa" w:w="60"/>
+              <w:right w:type="dxa" w:w="110"/>
+            </w:tcMar>
+          </w:tcPr>
+          <w:p>
+            <w:pPr>
+              <w:jc w:val="right"/>
+            </w:pPr>
+            <w:r>
+              <w:rPr>
+                <w:b w:val="false"/>
+                <w:bCs w:val="false"/>
+                <w:sz w:val="18"/>
+                <w:szCs w:val="18"/>
+              </w:rPr>
+              <w:t xml:space="preserve">GIL serializes Python; OS thread limit near 80 agents</w:t>
+            </w:r>
+          </w:p>
+        </w:tc>
+      </w:tr>
+      <w:tr>
+        <w:trPr>
+          <w:tblHeader w:val="false"/>
+        </w:trPr>
+        <w:tc>
+          <w:tcPr>
+            <w:tcW w:type="dxa" w:w="2400"/>
+            <w:tcBorders>
+              <w:top w:val="single" w:color="BBBBBB" w:sz="1"/>
+              <w:left w:val="single" w:color="BBBBBB" w:sz="1"/>
+              <w:bottom w:val="single" w:color="BBBBBB" w:sz="1"/>
+              <w:right w:val="single" w:color="BBBBBB" w:sz="1"/>
+            </w:tcBorders>
+            <w:shd w:fill="FFFFFF" w:val="clear"/>
+            <w:tcMar>
+              <w:top w:type="dxa" w:w="60"/>
+              <w:left w:type="dxa" w:w="110"/>
+              <w:bottom w:type="dxa" w:w="60"/>
+              <w:right w:type="dxa" w:w="110"/>
+            </w:tcMar>
+          </w:tcPr>
+          <w:p>
+            <w:pPr>
+              <w:jc w:val="left"/>
+            </w:pPr>
+            <w:r>
+              <w:rPr>
+                <w:b w:val="false"/>
+                <w:bCs w:val="false"/>
+                <w:sz w:val="18"/>
+                <w:szCs w:val="18"/>
+              </w:rPr>
+              <w:t xml:space="preserve">Parallel (processes)</w:t>
+            </w:r>
+          </w:p>
+        </w:tc>
+        <w:tc>
+          <w:tcPr>
+            <w:tcW w:type="dxa" w:w="2400"/>
+            <w:tcBorders>
+              <w:top w:val="single" w:color="BBBBBB" w:sz="1"/>
+              <w:left w:val="single" w:color="BBBBBB" w:sz="1"/>
+              <w:bottom w:val="single" w:color="BBBBBB" w:sz="1"/>
+              <w:right w:val="single" w:color="BBBBBB" w:sz="1"/>
+            </w:tcBorders>
+            <w:shd w:fill="FFFFFF" w:val="clear"/>
+            <w:tcMar>
+              <w:top w:type="dxa" w:w="60"/>
+              <w:left w:type="dxa" w:w="110"/>
+              <w:bottom w:type="dxa" w:w="60"/>
+              <w:right w:type="dxa" w:w="110"/>
+            </w:tcMar>
+          </w:tcPr>
+          <w:p>
+            <w:pPr>
+              <w:jc w:val="right"/>
+            </w:pPr>
+            <w:r>
+              <w:rPr>
+                <w:b w:val="false"/>
+                <w:bCs w:val="false"/>
+                <w:sz w:val="18"/>
+                <w:szCs w:val="18"/>
+              </w:rPr>
+              <w:t xml:space="preserve">up to all 12</w:t>
+            </w:r>
+          </w:p>
+        </w:tc>
+        <w:tc>
+          <w:tcPr>
+            <w:tcW w:type="dxa" w:w="4560"/>
+            <w:tcBorders>
+              <w:top w:val="single" w:color="BBBBBB" w:sz="1"/>
+              <w:left w:val="single" w:color="BBBBBB" w:sz="1"/>
+              <w:bottom w:val="single" w:color="BBBBBB" w:sz="1"/>
+              <w:right w:val="single" w:color="BBBBBB" w:sz="1"/>
+            </w:tcBorders>
+            <w:shd w:fill="FFFFFF" w:val="clear"/>
+            <w:tcMar>
+              <w:top w:type="dxa" w:w="60"/>
+              <w:left w:type="dxa" w:w="110"/>
+              <w:bottom w:type="dxa" w:w="60"/>
+              <w:right w:type="dxa" w:w="110"/>
+            </w:tcMar>
+          </w:tcPr>
+          <w:p>
+            <w:pPr>
+              <w:jc w:val="right"/>
+            </w:pPr>
+            <w:r>
+              <w:rPr>
+                <w:b w:val="false"/>
+                <w:bCs w:val="false"/>
+                <w:sz w:val="18"/>
+                <w:szCs w:val="18"/>
+              </w:rPr>
+              <w:t xml:space="preserve">true parallelism; host hits 0% idle; OS time-slices beyond core count</w:t>
+            </w:r>
+          </w:p>
+        </w:tc>
+      </w:tr>
+    </w:tbl>
+    <w:p>
+      <w:pPr>
+        <w:spacing w:after="120"/>
+      </w:pPr>
+      <w:r>
+        <w:rPr>
+          <w:sz w:val="22"/>
+          <w:szCs w:val="22"/>
+        </w:rPr>
+        <w:t xml:space="preserve">Findings:</w:t>
+      </w:r>
+    </w:p>
+    <w:p>
+      <w:pPr>
+        <w:pStyle w:val="ListParagraph"/>
+        <w:numPr>
+          <w:ilvl w:val="0"/>
+          <w:numId w:val="2"/>
+        </w:numPr>
+        <w:spacing w:after="60"/>
+      </w:pPr>
+      <w:r>
+        <w:rPr>
+          <w:sz w:val="22"/>
+          <w:szCs w:val="22"/>
+        </w:rPr>
+        <w:t xml:space="preserve">The SLIM node is not the bottleneck. It stays light, tens of megabytes of memory and at most about one core, even under the heaviest concurrent fan-out.</w:t>
+      </w:r>
+    </w:p>
+    <w:p>
+      <w:pPr>
+        <w:pStyle w:val="ListParagraph"/>
+        <w:numPr>
+          <w:ilvl w:val="0"/>
+          <w:numId w:val="2"/>
+        </w:numPr>
+        <w:spacing w:after="60"/>
+      </w:pPr>
+      <w:r>
+        <w:rPr>
+          <w:sz w:val="22"/>
+          <w:szCs w:val="22"/>
+        </w:rPr>
+        <w:t xml:space="preserve">The network is not the bottleneck. Traffic is loopback and totals only kilobytes; it is never the limiting factor in these runs.</w:t>
+      </w:r>
+    </w:p>
+    <w:p>
+      <w:pPr>
+        <w:pStyle w:val="ListParagraph"/>
+        <w:numPr>
+          <w:ilvl w:val="0"/>
+          <w:numId w:val="2"/>
+        </w:numPr>
+        <w:spacing w:after="60"/>
+      </w:pPr>
+      <w:r>
+        <w:rPr>
+          <w:sz w:val="22"/>
+          <w:szCs w:val="22"/>
+        </w:rPr>
+        <w:t xml:space="preserve">Client-side CPU is the primary bottleneck. In sequential and thread-concurrent modes the Python interpreter lock caps useful work at roughly 1.5 cores regardless of agent count; only the process-per-agent parallel mode uses all cores, at which point the host reaches 0 percent idle.</w:t>
+      </w:r>
+    </w:p>
+    <w:p>
+      <w:pPr>
+        <w:pStyle w:val="ListParagraph"/>
+        <w:numPr>
+          <w:ilvl w:val="0"/>
+          <w:numId w:val="2"/>
+        </w:numPr>
+        <w:spacing w:after="60"/>
+      </w:pPr>
+      <w:r>
+        <w:rPr>
+          <w:sz w:val="22"/>
+          <w:szCs w:val="22"/>
+        </w:rPr>
+        <w:t xml:space="preserve">At higher agent counts the limit shifts to host memory and process or thread count. Each HTTP/SLIM agent process is about 44 MB and each A2A agent process is about 136 MB, so A2A becomes memory-bound near 50 agents on 24 GB. The thread-concurrent mode separately hits the operating-system thread limit and fails to start new threads at around 80 agents, which is why scaling past that point uses the sequential or parallel modes.</w:t>
+      </w:r>
+    </w:p>
+    <w:p>
+      <w:pPr>
+        <w:pStyle w:val="Heading1"/>
+      </w:pPr>
+      <w:r>
+        <w:t xml:space="preserve">9. Issues found and fixed during testing</w:t>
       </w:r>
     </w:p>
     <w:p>
@@ -5301,7 +6519,7 @@
         <w:pStyle w:val="Heading1"/>
       </w:pPr>
       <w:r>
-        <w:t xml:space="preserve">9. How to reproduce</w:t>
+        <w:t xml:space="preserve">10. How to reproduce</w:t>
       </w:r>
     </w:p>
     <w:p>
@@ -5402,7 +6620,7 @@
         <w:pStyle w:val="Heading1"/>
       </w:pPr>
       <w:r>
-        <w:t xml:space="preserve">10. Limitations</w:t>
+        <w:t xml:space="preserve">11. Limitations</w:t>
       </w:r>
     </w:p>
     <w:p>

</xml_diff>